<commit_message>
Added Linux(shell script) docx file
</commit_message>
<xml_diff>
--- a/01_CoreJava/Oops_concepts.docx
+++ b/01_CoreJava/Oops_concepts.docx
@@ -124,8 +124,6 @@
         </w:rPr>
         <w:t xml:space="preserve"> of built-in classes, organized into </w:t>
       </w:r>
-      <w:bookmarkStart w:id="0" w:name="_GoBack"/>
-      <w:bookmarkEnd w:id="0"/>
       <w:r>
         <w:rPr>
           <w:rStyle w:val="10"/>
@@ -493,7 +491,6 @@
             <w:insideH w:val="none" w:color="auto" w:sz="0" w:space="0"/>
             <w:insideV w:val="none" w:color="auto" w:sz="0" w:space="0"/>
           </w:tblBorders>
-          <w:shd w:val="clear" w:color="auto" w:fill="auto"/>
           <w:tblCellMar>
             <w:top w:w="15" w:type="dxa"/>
             <w:left w:w="15" w:type="dxa"/>
@@ -659,101 +656,6 @@
                 <w:lang w:val="en-US" w:eastAsia="zh-CN" w:bidi="ar"/>
               </w:rPr>
               <w:t>Boolean</w:t>
-            </w:r>
-          </w:p>
-        </w:tc>
-      </w:tr>
-      <w:tr>
-        <w:tblPrEx>
-          <w:tblBorders>
-            <w:top w:val="none" w:color="auto" w:sz="0" w:space="0"/>
-            <w:left w:val="none" w:color="auto" w:sz="0" w:space="0"/>
-            <w:bottom w:val="none" w:color="auto" w:sz="0" w:space="0"/>
-            <w:right w:val="none" w:color="auto" w:sz="0" w:space="0"/>
-            <w:insideH w:val="none" w:color="auto" w:sz="0" w:space="0"/>
-            <w:insideV w:val="none" w:color="auto" w:sz="0" w:space="0"/>
-          </w:tblBorders>
-          <w:tblCellMar>
-            <w:top w:w="15" w:type="dxa"/>
-            <w:left w:w="15" w:type="dxa"/>
-            <w:bottom w:w="15" w:type="dxa"/>
-            <w:right w:w="15" w:type="dxa"/>
-          </w:tblCellMar>
-        </w:tblPrEx>
-        <w:trPr>
-          <w:tblCellSpacing w:w="15" w:type="dxa"/>
-        </w:trPr>
-        <w:tc>
-          <w:tcPr>
-            <w:tcW w:w="0" w:type="auto"/>
-            <w:shd w:val="clear" w:color="auto" w:fill="auto"/>
-            <w:vAlign w:val="center"/>
-          </w:tcPr>
-          <w:p>
-            <w:pPr>
-              <w:keepNext w:val="0"/>
-              <w:keepLines w:val="0"/>
-              <w:widowControl/>
-              <w:suppressLineNumbers w:val="0"/>
-              <w:jc w:val="left"/>
-            </w:pPr>
-            <w:r>
-              <w:rPr>
-                <w:rFonts w:ascii="SimSun" w:hAnsi="SimSun" w:eastAsia="SimSun" w:cs="SimSun"/>
-                <w:kern w:val="0"/>
-                <w:sz w:val="24"/>
-                <w:szCs w:val="24"/>
-                <w:lang w:val="en-US" w:eastAsia="zh-CN" w:bidi="ar"/>
-              </w:rPr>
-              <w:t>Math &amp; numbers</w:t>
-            </w:r>
-          </w:p>
-        </w:tc>
-        <w:tc>
-          <w:tcPr>
-            <w:tcW w:w="0" w:type="auto"/>
-            <w:shd w:val="clear" w:color="auto" w:fill="auto"/>
-            <w:vAlign w:val="center"/>
-          </w:tcPr>
-          <w:p>
-            <w:pPr>
-              <w:keepNext w:val="0"/>
-              <w:keepLines w:val="0"/>
-              <w:widowControl/>
-              <w:suppressLineNumbers w:val="0"/>
-              <w:jc w:val="left"/>
-            </w:pPr>
-            <w:r>
-              <w:rPr>
-                <w:rStyle w:val="8"/>
-                <w:rFonts w:ascii="SimSun" w:hAnsi="SimSun" w:eastAsia="SimSun" w:cs="SimSun"/>
-                <w:kern w:val="0"/>
-                <w:sz w:val="24"/>
-                <w:szCs w:val="24"/>
-                <w:lang w:val="en-US" w:eastAsia="zh-CN" w:bidi="ar"/>
-              </w:rPr>
-              <w:t>Math</w:t>
-            </w:r>
-            <w:r>
-              <w:rPr>
-                <w:rFonts w:ascii="SimSun" w:hAnsi="SimSun" w:eastAsia="SimSun" w:cs="SimSun"/>
-                <w:kern w:val="0"/>
-                <w:sz w:val="24"/>
-                <w:szCs w:val="24"/>
-                <w:lang w:val="en-US" w:eastAsia="zh-CN" w:bidi="ar"/>
-              </w:rPr>
-              <w:t xml:space="preserve">, </w:t>
-            </w:r>
-            <w:r>
-              <w:rPr>
-                <w:rStyle w:val="8"/>
-                <w:rFonts w:ascii="SimSun" w:hAnsi="SimSun" w:eastAsia="SimSun" w:cs="SimSun"/>
-                <w:kern w:val="0"/>
-                <w:sz w:val="24"/>
-                <w:szCs w:val="24"/>
-                <w:lang w:val="en-US" w:eastAsia="zh-CN" w:bidi="ar"/>
-              </w:rPr>
-              <w:t>Number</w:t>
             </w:r>
           </w:p>
         </w:tc>
@@ -801,7 +703,7 @@
                 <w:szCs w:val="24"/>
                 <w:lang w:val="en-US" w:eastAsia="zh-CN" w:bidi="ar"/>
               </w:rPr>
-              <w:t>Threads &amp; errors</w:t>
+              <w:t>Math &amp; numbers</w:t>
             </w:r>
           </w:p>
         </w:tc>
@@ -828,7 +730,7 @@
                 <w:szCs w:val="24"/>
                 <w:lang w:val="en-US" w:eastAsia="zh-CN" w:bidi="ar"/>
               </w:rPr>
-              <w:t>Thread</w:t>
+              <w:t>Math</w:t>
             </w:r>
             <w:r>
               <w:rPr>
@@ -849,49 +751,7 @@
                 <w:szCs w:val="24"/>
                 <w:lang w:val="en-US" w:eastAsia="zh-CN" w:bidi="ar"/>
               </w:rPr>
-              <w:t>Runnable</w:t>
-            </w:r>
-            <w:r>
-              <w:rPr>
-                <w:rFonts w:ascii="SimSun" w:hAnsi="SimSun" w:eastAsia="SimSun" w:cs="SimSun"/>
-                <w:kern w:val="0"/>
-                <w:sz w:val="24"/>
-                <w:szCs w:val="24"/>
-                <w:lang w:val="en-US" w:eastAsia="zh-CN" w:bidi="ar"/>
-              </w:rPr>
-              <w:t xml:space="preserve">, </w:t>
-            </w:r>
-            <w:r>
-              <w:rPr>
-                <w:rStyle w:val="8"/>
-                <w:rFonts w:ascii="SimSun" w:hAnsi="SimSun" w:eastAsia="SimSun" w:cs="SimSun"/>
-                <w:kern w:val="0"/>
-                <w:sz w:val="24"/>
-                <w:szCs w:val="24"/>
-                <w:lang w:val="en-US" w:eastAsia="zh-CN" w:bidi="ar"/>
-              </w:rPr>
-              <w:t>Exception</w:t>
-            </w:r>
-            <w:r>
-              <w:rPr>
-                <w:rFonts w:ascii="SimSun" w:hAnsi="SimSun" w:eastAsia="SimSun" w:cs="SimSun"/>
-                <w:kern w:val="0"/>
-                <w:sz w:val="24"/>
-                <w:szCs w:val="24"/>
-                <w:lang w:val="en-US" w:eastAsia="zh-CN" w:bidi="ar"/>
-              </w:rPr>
-              <w:t xml:space="preserve">, </w:t>
-            </w:r>
-            <w:r>
-              <w:rPr>
-                <w:rStyle w:val="8"/>
-                <w:rFonts w:ascii="SimSun" w:hAnsi="SimSun" w:eastAsia="SimSun" w:cs="SimSun"/>
-                <w:kern w:val="0"/>
-                <w:sz w:val="24"/>
-                <w:szCs w:val="24"/>
-                <w:lang w:val="en-US" w:eastAsia="zh-CN" w:bidi="ar"/>
-              </w:rPr>
-              <w:t>Error</w:t>
+              <w:t>Number</w:t>
             </w:r>
           </w:p>
         </w:tc>
@@ -906,6 +766,145 @@
             <w:insideH w:val="none" w:color="auto" w:sz="0" w:space="0"/>
             <w:insideV w:val="none" w:color="auto" w:sz="0" w:space="0"/>
           </w:tblBorders>
+          <w:shd w:val="clear" w:color="auto" w:fill="auto"/>
+          <w:tblCellMar>
+            <w:top w:w="15" w:type="dxa"/>
+            <w:left w:w="15" w:type="dxa"/>
+            <w:bottom w:w="15" w:type="dxa"/>
+            <w:right w:w="15" w:type="dxa"/>
+          </w:tblCellMar>
+        </w:tblPrEx>
+        <w:trPr>
+          <w:tblCellSpacing w:w="15" w:type="dxa"/>
+        </w:trPr>
+        <w:tc>
+          <w:tcPr>
+            <w:tcW w:w="0" w:type="auto"/>
+            <w:shd w:val="clear" w:color="auto" w:fill="auto"/>
+            <w:vAlign w:val="center"/>
+          </w:tcPr>
+          <w:p>
+            <w:pPr>
+              <w:keepNext w:val="0"/>
+              <w:keepLines w:val="0"/>
+              <w:widowControl/>
+              <w:suppressLineNumbers w:val="0"/>
+              <w:jc w:val="left"/>
+            </w:pPr>
+            <w:r>
+              <w:rPr>
+                <w:rFonts w:ascii="SimSun" w:hAnsi="SimSun" w:eastAsia="SimSun" w:cs="SimSun"/>
+                <w:kern w:val="0"/>
+                <w:sz w:val="24"/>
+                <w:szCs w:val="24"/>
+                <w:lang w:val="en-US" w:eastAsia="zh-CN" w:bidi="ar"/>
+              </w:rPr>
+              <w:t>Threads &amp; errors</w:t>
+            </w:r>
+          </w:p>
+        </w:tc>
+        <w:tc>
+          <w:tcPr>
+            <w:tcW w:w="0" w:type="auto"/>
+            <w:shd w:val="clear" w:color="auto" w:fill="auto"/>
+            <w:vAlign w:val="center"/>
+          </w:tcPr>
+          <w:p>
+            <w:pPr>
+              <w:keepNext w:val="0"/>
+              <w:keepLines w:val="0"/>
+              <w:widowControl/>
+              <w:suppressLineNumbers w:val="0"/>
+              <w:jc w:val="left"/>
+            </w:pPr>
+            <w:r>
+              <w:rPr>
+                <w:rStyle w:val="8"/>
+                <w:rFonts w:ascii="SimSun" w:hAnsi="SimSun" w:eastAsia="SimSun" w:cs="SimSun"/>
+                <w:kern w:val="0"/>
+                <w:sz w:val="24"/>
+                <w:szCs w:val="24"/>
+                <w:lang w:val="en-US" w:eastAsia="zh-CN" w:bidi="ar"/>
+              </w:rPr>
+              <w:t>Thread</w:t>
+            </w:r>
+            <w:r>
+              <w:rPr>
+                <w:rFonts w:ascii="SimSun" w:hAnsi="SimSun" w:eastAsia="SimSun" w:cs="SimSun"/>
+                <w:kern w:val="0"/>
+                <w:sz w:val="24"/>
+                <w:szCs w:val="24"/>
+                <w:lang w:val="en-US" w:eastAsia="zh-CN" w:bidi="ar"/>
+              </w:rPr>
+              <w:t xml:space="preserve">, </w:t>
+            </w:r>
+            <w:r>
+              <w:rPr>
+                <w:rStyle w:val="8"/>
+                <w:rFonts w:ascii="SimSun" w:hAnsi="SimSun" w:eastAsia="SimSun" w:cs="SimSun"/>
+                <w:kern w:val="0"/>
+                <w:sz w:val="24"/>
+                <w:szCs w:val="24"/>
+                <w:lang w:val="en-US" w:eastAsia="zh-CN" w:bidi="ar"/>
+              </w:rPr>
+              <w:t>Runnable</w:t>
+            </w:r>
+            <w:r>
+              <w:rPr>
+                <w:rFonts w:ascii="SimSun" w:hAnsi="SimSun" w:eastAsia="SimSun" w:cs="SimSun"/>
+                <w:kern w:val="0"/>
+                <w:sz w:val="24"/>
+                <w:szCs w:val="24"/>
+                <w:lang w:val="en-US" w:eastAsia="zh-CN" w:bidi="ar"/>
+              </w:rPr>
+              <w:t xml:space="preserve">, </w:t>
+            </w:r>
+            <w:r>
+              <w:rPr>
+                <w:rStyle w:val="8"/>
+                <w:rFonts w:ascii="SimSun" w:hAnsi="SimSun" w:eastAsia="SimSun" w:cs="SimSun"/>
+                <w:kern w:val="0"/>
+                <w:sz w:val="24"/>
+                <w:szCs w:val="24"/>
+                <w:lang w:val="en-US" w:eastAsia="zh-CN" w:bidi="ar"/>
+              </w:rPr>
+              <w:t>Exception</w:t>
+            </w:r>
+            <w:r>
+              <w:rPr>
+                <w:rFonts w:ascii="SimSun" w:hAnsi="SimSun" w:eastAsia="SimSun" w:cs="SimSun"/>
+                <w:kern w:val="0"/>
+                <w:sz w:val="24"/>
+                <w:szCs w:val="24"/>
+                <w:lang w:val="en-US" w:eastAsia="zh-CN" w:bidi="ar"/>
+              </w:rPr>
+              <w:t xml:space="preserve">, </w:t>
+            </w:r>
+            <w:r>
+              <w:rPr>
+                <w:rStyle w:val="8"/>
+                <w:rFonts w:ascii="SimSun" w:hAnsi="SimSun" w:eastAsia="SimSun" w:cs="SimSun"/>
+                <w:kern w:val="0"/>
+                <w:sz w:val="24"/>
+                <w:szCs w:val="24"/>
+                <w:lang w:val="en-US" w:eastAsia="zh-CN" w:bidi="ar"/>
+              </w:rPr>
+              <w:t>Error</w:t>
+            </w:r>
+          </w:p>
+        </w:tc>
+      </w:tr>
+      <w:tr>
+        <w:tblPrEx>
+          <w:tblBorders>
+            <w:top w:val="none" w:color="auto" w:sz="0" w:space="0"/>
+            <w:left w:val="none" w:color="auto" w:sz="0" w:space="0"/>
+            <w:bottom w:val="none" w:color="auto" w:sz="0" w:space="0"/>
+            <w:right w:val="none" w:color="auto" w:sz="0" w:space="0"/>
+            <w:insideH w:val="none" w:color="auto" w:sz="0" w:space="0"/>
+            <w:insideV w:val="none" w:color="auto" w:sz="0" w:space="0"/>
+          </w:tblBorders>
+          <w:shd w:val="clear" w:color="auto" w:fill="auto"/>
           <w:tblCellMar>
             <w:top w:w="15" w:type="dxa"/>
             <w:left w:w="15" w:type="dxa"/>
@@ -1148,7 +1147,6 @@
             <w:insideH w:val="none" w:color="auto" w:sz="0" w:space="0"/>
             <w:insideV w:val="none" w:color="auto" w:sz="0" w:space="0"/>
           </w:tblBorders>
-          <w:shd w:val="clear" w:color="auto" w:fill="auto"/>
           <w:tblCellMar>
             <w:top w:w="15" w:type="dxa"/>
             <w:left w:w="15" w:type="dxa"/>
@@ -1642,7 +1640,6 @@
             <w:insideH w:val="none" w:color="auto" w:sz="0" w:space="0"/>
             <w:insideV w:val="none" w:color="auto" w:sz="0" w:space="0"/>
           </w:tblBorders>
-          <w:shd w:val="clear" w:color="auto" w:fill="auto"/>
           <w:tblCellMar>
             <w:top w:w="15" w:type="dxa"/>
             <w:left w:w="15" w:type="dxa"/>
@@ -1729,6 +1726,7 @@
             <w:insideH w:val="none" w:color="auto" w:sz="0" w:space="0"/>
             <w:insideV w:val="none" w:color="auto" w:sz="0" w:space="0"/>
           </w:tblBorders>
+          <w:shd w:val="clear" w:color="auto" w:fill="auto"/>
           <w:tblCellMar>
             <w:top w:w="15" w:type="dxa"/>
             <w:left w:w="15" w:type="dxa"/>
@@ -2507,7 +2505,6 @@
             <w:insideH w:val="none" w:color="auto" w:sz="0" w:space="0"/>
             <w:insideV w:val="none" w:color="auto" w:sz="0" w:space="0"/>
           </w:tblBorders>
-          <w:shd w:val="clear" w:color="auto" w:fill="auto"/>
           <w:tblCellMar>
             <w:top w:w="15" w:type="dxa"/>
             <w:left w:w="15" w:type="dxa"/>
@@ -2880,6 +2877,7 @@
             <w:insideH w:val="none" w:color="auto" w:sz="0" w:space="0"/>
             <w:insideV w:val="none" w:color="auto" w:sz="0" w:space="0"/>
           </w:tblBorders>
+          <w:shd w:val="clear" w:color="auto" w:fill="auto"/>
           <w:tblCellMar>
             <w:top w:w="15" w:type="dxa"/>
             <w:left w:w="15" w:type="dxa"/>
@@ -3345,7 +3343,6 @@
             <w:insideH w:val="none" w:color="auto" w:sz="0" w:space="0"/>
             <w:insideV w:val="none" w:color="auto" w:sz="0" w:space="0"/>
           </w:tblBorders>
-          <w:shd w:val="clear" w:color="auto" w:fill="auto"/>
           <w:tblCellMar>
             <w:top w:w="15" w:type="dxa"/>
             <w:left w:w="15" w:type="dxa"/>
@@ -3483,6 +3480,7 @@
             <w:insideH w:val="none" w:color="auto" w:sz="0" w:space="0"/>
             <w:insideV w:val="none" w:color="auto" w:sz="0" w:space="0"/>
           </w:tblBorders>
+          <w:shd w:val="clear" w:color="auto" w:fill="auto"/>
           <w:tblCellMar>
             <w:top w:w="15" w:type="dxa"/>
             <w:left w:w="15" w:type="dxa"/>
@@ -4015,6 +4013,7 @@
             <w:insideH w:val="none" w:color="auto" w:sz="0" w:space="0"/>
             <w:insideV w:val="none" w:color="auto" w:sz="0" w:space="0"/>
           </w:tblBorders>
+          <w:shd w:val="clear" w:color="auto" w:fill="auto"/>
           <w:tblCellMar>
             <w:top w:w="15" w:type="dxa"/>
             <w:left w:w="15" w:type="dxa"/>
@@ -6334,7 +6333,6 @@
             <w:insideH w:val="none" w:color="auto" w:sz="0" w:space="0"/>
             <w:insideV w:val="none" w:color="auto" w:sz="0" w:space="0"/>
           </w:tblBorders>
-          <w:shd w:val="clear" w:color="auto" w:fill="auto"/>
           <w:tblCellMar>
             <w:top w:w="15" w:type="dxa"/>
             <w:left w:w="15" w:type="dxa"/>
@@ -6409,7 +6407,6 @@
             <w:insideH w:val="none" w:color="auto" w:sz="0" w:space="0"/>
             <w:insideV w:val="none" w:color="auto" w:sz="0" w:space="0"/>
           </w:tblBorders>
-          <w:shd w:val="clear" w:color="auto" w:fill="auto"/>
           <w:tblCellMar>
             <w:top w:w="15" w:type="dxa"/>
             <w:left w:w="15" w:type="dxa"/>
@@ -8262,6 +8259,7 @@
             <w:insideH w:val="none" w:color="auto" w:sz="0" w:space="0"/>
             <w:insideV w:val="none" w:color="auto" w:sz="0" w:space="0"/>
           </w:tblBorders>
+          <w:shd w:val="clear" w:color="auto" w:fill="auto"/>
           <w:tblCellMar>
             <w:top w:w="15" w:type="dxa"/>
             <w:left w:w="15" w:type="dxa"/>
@@ -8396,80 +8394,6 @@
                 <w:lang w:val="en-US" w:eastAsia="zh-CN" w:bidi="ar"/>
               </w:rPr>
               <w:t>Suggests JVM to run Garbage Collector.</w:t>
-            </w:r>
-          </w:p>
-        </w:tc>
-      </w:tr>
-      <w:tr>
-        <w:tblPrEx>
-          <w:tblBorders>
-            <w:top w:val="none" w:color="auto" w:sz="0" w:space="0"/>
-            <w:left w:val="none" w:color="auto" w:sz="0" w:space="0"/>
-            <w:bottom w:val="none" w:color="auto" w:sz="0" w:space="0"/>
-            <w:right w:val="none" w:color="auto" w:sz="0" w:space="0"/>
-            <w:insideH w:val="none" w:color="auto" w:sz="0" w:space="0"/>
-            <w:insideV w:val="none" w:color="auto" w:sz="0" w:space="0"/>
-          </w:tblBorders>
-          <w:tblCellMar>
-            <w:top w:w="15" w:type="dxa"/>
-            <w:left w:w="15" w:type="dxa"/>
-            <w:bottom w:w="15" w:type="dxa"/>
-            <w:right w:w="15" w:type="dxa"/>
-          </w:tblCellMar>
-        </w:tblPrEx>
-        <w:trPr>
-          <w:tblCellSpacing w:w="15" w:type="dxa"/>
-        </w:trPr>
-        <w:tc>
-          <w:tcPr>
-            <w:tcW w:w="0" w:type="auto"/>
-            <w:shd w:val="clear" w:color="auto" w:fill="auto"/>
-            <w:vAlign w:val="center"/>
-          </w:tcPr>
-          <w:p>
-            <w:pPr>
-              <w:keepNext w:val="0"/>
-              <w:keepLines w:val="0"/>
-              <w:widowControl/>
-              <w:suppressLineNumbers w:val="0"/>
-              <w:jc w:val="left"/>
-            </w:pPr>
-            <w:r>
-              <w:rPr>
-                <w:rStyle w:val="8"/>
-                <w:rFonts w:ascii="SimSun" w:hAnsi="SimSun" w:eastAsia="SimSun" w:cs="SimSun"/>
-                <w:kern w:val="0"/>
-                <w:sz w:val="24"/>
-                <w:szCs w:val="24"/>
-                <w:lang w:val="en-US" w:eastAsia="zh-CN" w:bidi="ar"/>
-              </w:rPr>
-              <w:t>System.getenv()</w:t>
-            </w:r>
-          </w:p>
-        </w:tc>
-        <w:tc>
-          <w:tcPr>
-            <w:tcW w:w="0" w:type="auto"/>
-            <w:shd w:val="clear" w:color="auto" w:fill="auto"/>
-            <w:vAlign w:val="center"/>
-          </w:tcPr>
-          <w:p>
-            <w:pPr>
-              <w:keepNext w:val="0"/>
-              <w:keepLines w:val="0"/>
-              <w:widowControl/>
-              <w:suppressLineNumbers w:val="0"/>
-              <w:jc w:val="left"/>
-            </w:pPr>
-            <w:r>
-              <w:rPr>
-                <w:rFonts w:ascii="SimSun" w:hAnsi="SimSun" w:eastAsia="SimSun" w:cs="SimSun"/>
-                <w:kern w:val="0"/>
-                <w:sz w:val="24"/>
-                <w:szCs w:val="24"/>
-                <w:lang w:val="en-US" w:eastAsia="zh-CN" w:bidi="ar"/>
-              </w:rPr>
-              <w:t>Returns system environment variables.</w:t>
             </w:r>
           </w:p>
         </w:tc>
@@ -8518,6 +8442,80 @@
                 <w:szCs w:val="24"/>
                 <w:lang w:val="en-US" w:eastAsia="zh-CN" w:bidi="ar"/>
               </w:rPr>
+              <w:t>System.getenv()</w:t>
+            </w:r>
+          </w:p>
+        </w:tc>
+        <w:tc>
+          <w:tcPr>
+            <w:tcW w:w="0" w:type="auto"/>
+            <w:shd w:val="clear" w:color="auto" w:fill="auto"/>
+            <w:vAlign w:val="center"/>
+          </w:tcPr>
+          <w:p>
+            <w:pPr>
+              <w:keepNext w:val="0"/>
+              <w:keepLines w:val="0"/>
+              <w:widowControl/>
+              <w:suppressLineNumbers w:val="0"/>
+              <w:jc w:val="left"/>
+            </w:pPr>
+            <w:r>
+              <w:rPr>
+                <w:rFonts w:ascii="SimSun" w:hAnsi="SimSun" w:eastAsia="SimSun" w:cs="SimSun"/>
+                <w:kern w:val="0"/>
+                <w:sz w:val="24"/>
+                <w:szCs w:val="24"/>
+                <w:lang w:val="en-US" w:eastAsia="zh-CN" w:bidi="ar"/>
+              </w:rPr>
+              <w:t>Returns system environment variables.</w:t>
+            </w:r>
+          </w:p>
+        </w:tc>
+      </w:tr>
+      <w:tr>
+        <w:tblPrEx>
+          <w:tblBorders>
+            <w:top w:val="none" w:color="auto" w:sz="0" w:space="0"/>
+            <w:left w:val="none" w:color="auto" w:sz="0" w:space="0"/>
+            <w:bottom w:val="none" w:color="auto" w:sz="0" w:space="0"/>
+            <w:right w:val="none" w:color="auto" w:sz="0" w:space="0"/>
+            <w:insideH w:val="none" w:color="auto" w:sz="0" w:space="0"/>
+            <w:insideV w:val="none" w:color="auto" w:sz="0" w:space="0"/>
+          </w:tblBorders>
+          <w:tblCellMar>
+            <w:top w:w="15" w:type="dxa"/>
+            <w:left w:w="15" w:type="dxa"/>
+            <w:bottom w:w="15" w:type="dxa"/>
+            <w:right w:w="15" w:type="dxa"/>
+          </w:tblCellMar>
+        </w:tblPrEx>
+        <w:trPr>
+          <w:tblCellSpacing w:w="15" w:type="dxa"/>
+        </w:trPr>
+        <w:tc>
+          <w:tcPr>
+            <w:tcW w:w="0" w:type="auto"/>
+            <w:shd w:val="clear" w:color="auto" w:fill="auto"/>
+            <w:vAlign w:val="center"/>
+          </w:tcPr>
+          <w:p>
+            <w:pPr>
+              <w:keepNext w:val="0"/>
+              <w:keepLines w:val="0"/>
+              <w:widowControl/>
+              <w:suppressLineNumbers w:val="0"/>
+              <w:jc w:val="left"/>
+            </w:pPr>
+            <w:r>
+              <w:rPr>
+                <w:rStyle w:val="8"/>
+                <w:rFonts w:ascii="SimSun" w:hAnsi="SimSun" w:eastAsia="SimSun" w:cs="SimSun"/>
+                <w:kern w:val="0"/>
+                <w:sz w:val="24"/>
+                <w:szCs w:val="24"/>
+                <w:lang w:val="en-US" w:eastAsia="zh-CN" w:bidi="ar"/>
+              </w:rPr>
               <w:t>System.getProperty(String key)</w:t>
             </w:r>
           </w:p>
@@ -9705,7 +9703,6 @@
             <w:insideH w:val="none" w:color="auto" w:sz="0" w:space="0"/>
             <w:insideV w:val="none" w:color="auto" w:sz="0" w:space="0"/>
           </w:tblBorders>
-          <w:shd w:val="clear" w:color="auto" w:fill="auto"/>
           <w:tblCellMar>
             <w:top w:w="15" w:type="dxa"/>
             <w:left w:w="15" w:type="dxa"/>
@@ -9810,6 +9807,170 @@
                 <w:lang w:val="en-US" w:eastAsia="zh-CN" w:bidi="ar"/>
               </w:rPr>
               <w:t>Key Methods / Uses</w:t>
+            </w:r>
+          </w:p>
+        </w:tc>
+      </w:tr>
+      <w:tr>
+        <w:tblPrEx>
+          <w:tblBorders>
+            <w:top w:val="none" w:color="auto" w:sz="0" w:space="0"/>
+            <w:left w:val="none" w:color="auto" w:sz="0" w:space="0"/>
+            <w:bottom w:val="none" w:color="auto" w:sz="0" w:space="0"/>
+            <w:right w:val="none" w:color="auto" w:sz="0" w:space="0"/>
+            <w:insideH w:val="none" w:color="auto" w:sz="0" w:space="0"/>
+            <w:insideV w:val="none" w:color="auto" w:sz="0" w:space="0"/>
+          </w:tblBorders>
+          <w:tblCellMar>
+            <w:top w:w="15" w:type="dxa"/>
+            <w:left w:w="15" w:type="dxa"/>
+            <w:bottom w:w="15" w:type="dxa"/>
+            <w:right w:w="15" w:type="dxa"/>
+          </w:tblCellMar>
+        </w:tblPrEx>
+        <w:trPr>
+          <w:tblCellSpacing w:w="15" w:type="dxa"/>
+        </w:trPr>
+        <w:tc>
+          <w:tcPr>
+            <w:tcW w:w="0" w:type="auto"/>
+            <w:shd w:val="clear" w:color="auto" w:fill="auto"/>
+            <w:vAlign w:val="center"/>
+          </w:tcPr>
+          <w:p>
+            <w:pPr>
+              <w:keepNext w:val="0"/>
+              <w:keepLines w:val="0"/>
+              <w:widowControl/>
+              <w:suppressLineNumbers w:val="0"/>
+              <w:jc w:val="left"/>
+            </w:pPr>
+            <w:r>
+              <w:rPr>
+                <w:rStyle w:val="8"/>
+                <w:rFonts w:ascii="SimSun" w:hAnsi="SimSun" w:eastAsia="SimSun" w:cs="SimSun"/>
+                <w:kern w:val="0"/>
+                <w:sz w:val="24"/>
+                <w:szCs w:val="24"/>
+                <w:lang w:val="en-US" w:eastAsia="zh-CN" w:bidi="ar"/>
+              </w:rPr>
+              <w:t>Object</w:t>
+            </w:r>
+          </w:p>
+        </w:tc>
+        <w:tc>
+          <w:tcPr>
+            <w:tcW w:w="0" w:type="auto"/>
+            <w:shd w:val="clear" w:color="auto" w:fill="auto"/>
+            <w:vAlign w:val="center"/>
+          </w:tcPr>
+          <w:p>
+            <w:pPr>
+              <w:keepNext w:val="0"/>
+              <w:keepLines w:val="0"/>
+              <w:widowControl/>
+              <w:suppressLineNumbers w:val="0"/>
+              <w:jc w:val="left"/>
+            </w:pPr>
+            <w:r>
+              <w:rPr>
+                <w:rFonts w:ascii="SimSun" w:hAnsi="SimSun" w:eastAsia="SimSun" w:cs="SimSun"/>
+                <w:kern w:val="0"/>
+                <w:sz w:val="24"/>
+                <w:szCs w:val="24"/>
+                <w:lang w:val="en-US" w:eastAsia="zh-CN" w:bidi="ar"/>
+              </w:rPr>
+              <w:t>Base class of all classes</w:t>
+            </w:r>
+          </w:p>
+        </w:tc>
+        <w:tc>
+          <w:tcPr>
+            <w:tcW w:w="0" w:type="auto"/>
+            <w:shd w:val="clear" w:color="auto" w:fill="auto"/>
+            <w:vAlign w:val="center"/>
+          </w:tcPr>
+          <w:p>
+            <w:pPr>
+              <w:keepNext w:val="0"/>
+              <w:keepLines w:val="0"/>
+              <w:widowControl/>
+              <w:suppressLineNumbers w:val="0"/>
+              <w:jc w:val="left"/>
+            </w:pPr>
+            <w:r>
+              <w:rPr>
+                <w:rStyle w:val="8"/>
+                <w:rFonts w:ascii="SimSun" w:hAnsi="SimSun" w:eastAsia="SimSun" w:cs="SimSun"/>
+                <w:kern w:val="0"/>
+                <w:sz w:val="24"/>
+                <w:szCs w:val="24"/>
+                <w:lang w:val="en-US" w:eastAsia="zh-CN" w:bidi="ar"/>
+              </w:rPr>
+              <w:t>equals()</w:t>
+            </w:r>
+            <w:r>
+              <w:rPr>
+                <w:rFonts w:ascii="SimSun" w:hAnsi="SimSun" w:eastAsia="SimSun" w:cs="SimSun"/>
+                <w:kern w:val="0"/>
+                <w:sz w:val="24"/>
+                <w:szCs w:val="24"/>
+                <w:lang w:val="en-US" w:eastAsia="zh-CN" w:bidi="ar"/>
+              </w:rPr>
+              <w:t xml:space="preserve">, </w:t>
+            </w:r>
+            <w:r>
+              <w:rPr>
+                <w:rStyle w:val="8"/>
+                <w:rFonts w:ascii="SimSun" w:hAnsi="SimSun" w:eastAsia="SimSun" w:cs="SimSun"/>
+                <w:kern w:val="0"/>
+                <w:sz w:val="24"/>
+                <w:szCs w:val="24"/>
+                <w:lang w:val="en-US" w:eastAsia="zh-CN" w:bidi="ar"/>
+              </w:rPr>
+              <w:t>toString()</w:t>
+            </w:r>
+            <w:r>
+              <w:rPr>
+                <w:rFonts w:ascii="SimSun" w:hAnsi="SimSun" w:eastAsia="SimSun" w:cs="SimSun"/>
+                <w:kern w:val="0"/>
+                <w:sz w:val="24"/>
+                <w:szCs w:val="24"/>
+                <w:lang w:val="en-US" w:eastAsia="zh-CN" w:bidi="ar"/>
+              </w:rPr>
+              <w:t xml:space="preserve">, </w:t>
+            </w:r>
+            <w:r>
+              <w:rPr>
+                <w:rStyle w:val="8"/>
+                <w:rFonts w:ascii="SimSun" w:hAnsi="SimSun" w:eastAsia="SimSun" w:cs="SimSun"/>
+                <w:kern w:val="0"/>
+                <w:sz w:val="24"/>
+                <w:szCs w:val="24"/>
+                <w:lang w:val="en-US" w:eastAsia="zh-CN" w:bidi="ar"/>
+              </w:rPr>
+              <w:t>hashCode()</w:t>
+            </w:r>
+            <w:r>
+              <w:rPr>
+                <w:rFonts w:ascii="SimSun" w:hAnsi="SimSun" w:eastAsia="SimSun" w:cs="SimSun"/>
+                <w:kern w:val="0"/>
+                <w:sz w:val="24"/>
+                <w:szCs w:val="24"/>
+                <w:lang w:val="en-US" w:eastAsia="zh-CN" w:bidi="ar"/>
+              </w:rPr>
+              <w:t xml:space="preserve">, </w:t>
+            </w:r>
+            <w:r>
+              <w:rPr>
+                <w:rStyle w:val="8"/>
+                <w:rFonts w:ascii="SimSun" w:hAnsi="SimSun" w:eastAsia="SimSun" w:cs="SimSun"/>
+                <w:kern w:val="0"/>
+                <w:sz w:val="24"/>
+                <w:szCs w:val="24"/>
+                <w:lang w:val="en-US" w:eastAsia="zh-CN" w:bidi="ar"/>
+              </w:rPr>
+              <w:t>getClass()</w:t>
             </w:r>
           </w:p>
         </w:tc>
@@ -9858,7 +10019,7 @@
                 <w:szCs w:val="24"/>
                 <w:lang w:val="en-US" w:eastAsia="zh-CN" w:bidi="ar"/>
               </w:rPr>
-              <w:t>Object</w:t>
+              <w:t>Class</w:t>
             </w:r>
           </w:p>
         </w:tc>
@@ -9884,7 +10045,7 @@
                 <w:szCs w:val="24"/>
                 <w:lang w:val="en-US" w:eastAsia="zh-CN" w:bidi="ar"/>
               </w:rPr>
-              <w:t>Base class of all classes</w:t>
+              <w:t>Represents class metadata</w:t>
             </w:r>
           </w:p>
         </w:tc>
@@ -9911,7 +10072,7 @@
                 <w:szCs w:val="24"/>
                 <w:lang w:val="en-US" w:eastAsia="zh-CN" w:bidi="ar"/>
               </w:rPr>
-              <w:t>equals()</w:t>
+              <w:t>getName()</w:t>
             </w:r>
             <w:r>
               <w:rPr>
@@ -9932,7 +10093,7 @@
                 <w:szCs w:val="24"/>
                 <w:lang w:val="en-US" w:eastAsia="zh-CN" w:bidi="ar"/>
               </w:rPr>
-              <w:t>toString()</w:t>
+              <w:t>getSuperclass()</w:t>
             </w:r>
             <w:r>
               <w:rPr>
@@ -9953,28 +10114,7 @@
                 <w:szCs w:val="24"/>
                 <w:lang w:val="en-US" w:eastAsia="zh-CN" w:bidi="ar"/>
               </w:rPr>
-              <w:t>hashCode()</w:t>
-            </w:r>
-            <w:r>
-              <w:rPr>
-                <w:rFonts w:ascii="SimSun" w:hAnsi="SimSun" w:eastAsia="SimSun" w:cs="SimSun"/>
-                <w:kern w:val="0"/>
-                <w:sz w:val="24"/>
-                <w:szCs w:val="24"/>
-                <w:lang w:val="en-US" w:eastAsia="zh-CN" w:bidi="ar"/>
-              </w:rPr>
-              <w:t xml:space="preserve">, </w:t>
-            </w:r>
-            <w:r>
-              <w:rPr>
-                <w:rStyle w:val="8"/>
-                <w:rFonts w:ascii="SimSun" w:hAnsi="SimSun" w:eastAsia="SimSun" w:cs="SimSun"/>
-                <w:kern w:val="0"/>
-                <w:sz w:val="24"/>
-                <w:szCs w:val="24"/>
-                <w:lang w:val="en-US" w:eastAsia="zh-CN" w:bidi="ar"/>
-              </w:rPr>
-              <w:t>getClass()</w:t>
+              <w:t>getDeclaredMethods()</w:t>
             </w:r>
           </w:p>
         </w:tc>
@@ -9989,151 +10129,6 @@
             <w:insideH w:val="none" w:color="auto" w:sz="0" w:space="0"/>
             <w:insideV w:val="none" w:color="auto" w:sz="0" w:space="0"/>
           </w:tblBorders>
-          <w:shd w:val="clear" w:color="auto" w:fill="auto"/>
-          <w:tblCellMar>
-            <w:top w:w="15" w:type="dxa"/>
-            <w:left w:w="15" w:type="dxa"/>
-            <w:bottom w:w="15" w:type="dxa"/>
-            <w:right w:w="15" w:type="dxa"/>
-          </w:tblCellMar>
-        </w:tblPrEx>
-        <w:trPr>
-          <w:tblCellSpacing w:w="15" w:type="dxa"/>
-        </w:trPr>
-        <w:tc>
-          <w:tcPr>
-            <w:tcW w:w="0" w:type="auto"/>
-            <w:shd w:val="clear" w:color="auto" w:fill="auto"/>
-            <w:vAlign w:val="center"/>
-          </w:tcPr>
-          <w:p>
-            <w:pPr>
-              <w:keepNext w:val="0"/>
-              <w:keepLines w:val="0"/>
-              <w:widowControl/>
-              <w:suppressLineNumbers w:val="0"/>
-              <w:jc w:val="left"/>
-            </w:pPr>
-            <w:r>
-              <w:rPr>
-                <w:rStyle w:val="8"/>
-                <w:rFonts w:ascii="SimSun" w:hAnsi="SimSun" w:eastAsia="SimSun" w:cs="SimSun"/>
-                <w:kern w:val="0"/>
-                <w:sz w:val="24"/>
-                <w:szCs w:val="24"/>
-                <w:lang w:val="en-US" w:eastAsia="zh-CN" w:bidi="ar"/>
-              </w:rPr>
-              <w:t>Class</w:t>
-            </w:r>
-          </w:p>
-        </w:tc>
-        <w:tc>
-          <w:tcPr>
-            <w:tcW w:w="0" w:type="auto"/>
-            <w:shd w:val="clear" w:color="auto" w:fill="auto"/>
-            <w:vAlign w:val="center"/>
-          </w:tcPr>
-          <w:p>
-            <w:pPr>
-              <w:keepNext w:val="0"/>
-              <w:keepLines w:val="0"/>
-              <w:widowControl/>
-              <w:suppressLineNumbers w:val="0"/>
-              <w:jc w:val="left"/>
-            </w:pPr>
-            <w:r>
-              <w:rPr>
-                <w:rFonts w:ascii="SimSun" w:hAnsi="SimSun" w:eastAsia="SimSun" w:cs="SimSun"/>
-                <w:kern w:val="0"/>
-                <w:sz w:val="24"/>
-                <w:szCs w:val="24"/>
-                <w:lang w:val="en-US" w:eastAsia="zh-CN" w:bidi="ar"/>
-              </w:rPr>
-              <w:t>Represents class metadata</w:t>
-            </w:r>
-          </w:p>
-        </w:tc>
-        <w:tc>
-          <w:tcPr>
-            <w:tcW w:w="0" w:type="auto"/>
-            <w:shd w:val="clear" w:color="auto" w:fill="auto"/>
-            <w:vAlign w:val="center"/>
-          </w:tcPr>
-          <w:p>
-            <w:pPr>
-              <w:keepNext w:val="0"/>
-              <w:keepLines w:val="0"/>
-              <w:widowControl/>
-              <w:suppressLineNumbers w:val="0"/>
-              <w:jc w:val="left"/>
-            </w:pPr>
-            <w:r>
-              <w:rPr>
-                <w:rStyle w:val="8"/>
-                <w:rFonts w:ascii="SimSun" w:hAnsi="SimSun" w:eastAsia="SimSun" w:cs="SimSun"/>
-                <w:kern w:val="0"/>
-                <w:sz w:val="24"/>
-                <w:szCs w:val="24"/>
-                <w:lang w:val="en-US" w:eastAsia="zh-CN" w:bidi="ar"/>
-              </w:rPr>
-              <w:t>getName()</w:t>
-            </w:r>
-            <w:r>
-              <w:rPr>
-                <w:rFonts w:ascii="SimSun" w:hAnsi="SimSun" w:eastAsia="SimSun" w:cs="SimSun"/>
-                <w:kern w:val="0"/>
-                <w:sz w:val="24"/>
-                <w:szCs w:val="24"/>
-                <w:lang w:val="en-US" w:eastAsia="zh-CN" w:bidi="ar"/>
-              </w:rPr>
-              <w:t xml:space="preserve">, </w:t>
-            </w:r>
-            <w:r>
-              <w:rPr>
-                <w:rStyle w:val="8"/>
-                <w:rFonts w:ascii="SimSun" w:hAnsi="SimSun" w:eastAsia="SimSun" w:cs="SimSun"/>
-                <w:kern w:val="0"/>
-                <w:sz w:val="24"/>
-                <w:szCs w:val="24"/>
-                <w:lang w:val="en-US" w:eastAsia="zh-CN" w:bidi="ar"/>
-              </w:rPr>
-              <w:t>getSuperclass()</w:t>
-            </w:r>
-            <w:r>
-              <w:rPr>
-                <w:rFonts w:ascii="SimSun" w:hAnsi="SimSun" w:eastAsia="SimSun" w:cs="SimSun"/>
-                <w:kern w:val="0"/>
-                <w:sz w:val="24"/>
-                <w:szCs w:val="24"/>
-                <w:lang w:val="en-US" w:eastAsia="zh-CN" w:bidi="ar"/>
-              </w:rPr>
-              <w:t xml:space="preserve">, </w:t>
-            </w:r>
-            <w:r>
-              <w:rPr>
-                <w:rStyle w:val="8"/>
-                <w:rFonts w:ascii="SimSun" w:hAnsi="SimSun" w:eastAsia="SimSun" w:cs="SimSun"/>
-                <w:kern w:val="0"/>
-                <w:sz w:val="24"/>
-                <w:szCs w:val="24"/>
-                <w:lang w:val="en-US" w:eastAsia="zh-CN" w:bidi="ar"/>
-              </w:rPr>
-              <w:t>getDeclaredMethods()</w:t>
-            </w:r>
-          </w:p>
-        </w:tc>
-      </w:tr>
-      <w:tr>
-        <w:tblPrEx>
-          <w:tblBorders>
-            <w:top w:val="none" w:color="auto" w:sz="0" w:space="0"/>
-            <w:left w:val="none" w:color="auto" w:sz="0" w:space="0"/>
-            <w:bottom w:val="none" w:color="auto" w:sz="0" w:space="0"/>
-            <w:right w:val="none" w:color="auto" w:sz="0" w:space="0"/>
-            <w:insideH w:val="none" w:color="auto" w:sz="0" w:space="0"/>
-            <w:insideV w:val="none" w:color="auto" w:sz="0" w:space="0"/>
-          </w:tblBorders>
-          <w:shd w:val="clear" w:color="auto" w:fill="auto"/>
           <w:tblCellMar>
             <w:top w:w="15" w:type="dxa"/>
             <w:left w:w="15" w:type="dxa"/>
@@ -17149,6 +17144,8 @@
         <w:suppressLineNumbers w:val="0"/>
         <w:spacing w:before="0" w:beforeAutospacing="1" w:after="0" w:afterAutospacing="1"/>
       </w:pPr>
+      <w:bookmarkStart w:id="0" w:name="_GoBack"/>
+      <w:bookmarkEnd w:id="0"/>
     </w:p>
     <w:p>
       <w:pPr>
@@ -17194,9 +17191,9 @@
       <w:r>
         <w:drawing>
           <wp:inline distT="0" distB="0" distL="114300" distR="114300">
-            <wp:extent cx="5130800" cy="6755765"/>
-            <wp:effectExtent l="0" t="0" r="5080" b="10795"/>
-            <wp:docPr id="92" name="Picture 14"/>
+            <wp:extent cx="5268595" cy="6276340"/>
+            <wp:effectExtent l="0" t="0" r="4445" b="2540"/>
+            <wp:docPr id="1" name="Picture 16"/>
             <wp:cNvGraphicFramePr>
               <a:graphicFrameLocks xmlns:a="http://schemas.openxmlformats.org/drawingml/2006/main" noChangeAspect="1"/>
             </wp:cNvGraphicFramePr>
@@ -17204,7 +17201,7 @@
               <a:graphicData uri="http://schemas.openxmlformats.org/drawingml/2006/picture">
                 <pic:pic xmlns:pic="http://schemas.openxmlformats.org/drawingml/2006/picture">
                   <pic:nvPicPr>
-                    <pic:cNvPr id="92" name="Picture 14"/>
+                    <pic:cNvPr id="1" name="Picture 16"/>
                     <pic:cNvPicPr>
                       <a:picLocks noChangeAspect="1"/>
                     </pic:cNvPicPr>
@@ -17218,7 +17215,7 @@
                   <pic:spPr>
                     <a:xfrm>
                       <a:off x="0" y="0"/>
-                      <a:ext cx="5130800" cy="6755765"/>
+                      <a:ext cx="5268595" cy="6276340"/>
                     </a:xfrm>
                     <a:prstGeom prst="rect">
                       <a:avLst/>
@@ -17236,6 +17233,7 @@
       </w:r>
     </w:p>
     <w:p/>
+    <w:p/>
     <w:p>
       <w:pPr>
         <w:numPr>
@@ -17303,9 +17301,9 @@
       <w:r>
         <w:drawing>
           <wp:inline distT="0" distB="0" distL="114300" distR="114300">
-            <wp:extent cx="5146040" cy="782955"/>
-            <wp:effectExtent l="0" t="0" r="5080" b="9525"/>
-            <wp:docPr id="93" name="Picture 15"/>
+            <wp:extent cx="5269230" cy="941070"/>
+            <wp:effectExtent l="0" t="0" r="3810" b="3810"/>
+            <wp:docPr id="3" name="Picture 17"/>
             <wp:cNvGraphicFramePr>
               <a:graphicFrameLocks xmlns:a="http://schemas.openxmlformats.org/drawingml/2006/main" noChangeAspect="1"/>
             </wp:cNvGraphicFramePr>
@@ -17313,7 +17311,7 @@
               <a:graphicData uri="http://schemas.openxmlformats.org/drawingml/2006/picture">
                 <pic:pic xmlns:pic="http://schemas.openxmlformats.org/drawingml/2006/picture">
                   <pic:nvPicPr>
-                    <pic:cNvPr id="93" name="Picture 15"/>
+                    <pic:cNvPr id="3" name="Picture 17"/>
                     <pic:cNvPicPr>
                       <a:picLocks noChangeAspect="1"/>
                     </pic:cNvPicPr>
@@ -17327,7 +17325,7 @@
                   <pic:spPr>
                     <a:xfrm>
                       <a:off x="0" y="0"/>
-                      <a:ext cx="5146040" cy="782955"/>
+                      <a:ext cx="5269230" cy="941070"/>
                     </a:xfrm>
                     <a:prstGeom prst="rect">
                       <a:avLst/>
@@ -17379,12 +17377,13 @@
       </w:r>
       <w:r>
         <w:rPr>
-          <w:rStyle w:val="8"/>
-        </w:rPr>
-        <w:t>-10</w:t>
-      </w:r>
-      <w:r>
-        <w:t xml:space="preserve"> is rejected.</w:t>
+          <w:rFonts w:hint="default"/>
+          <w:lang w:val="en-US"/>
+        </w:rPr>
+        <w:t>negative num of age will</w:t>
+      </w:r>
+      <w:r>
+        <w:t xml:space="preserve"> rejected.</w:t>
       </w:r>
     </w:p>
     <w:p>

</xml_diff>